<commit_message>
Complete history reset and round review
</commit_message>
<xml_diff>
--- a/Descripcion_Funcionalidades.docx
+++ b/Descripcion_Funcionalidades.docx
@@ -120,6 +120,18 @@
         <w:spacing w:after="80"/>
       </w:pPr>
       <w:r>
+        <w:t xml:space="preserve">Registro de correctas, incorrectas, timeout, puntos y tiempo de respuesta por pregunta.</w:t>
+      </w:r>
+    </w:p>
+    <w:p>
+      <w:pPr>
+        <w:numPr>
+          <w:ilvl w:val="0"/>
+          <w:numId w:val="1"/>
+        </w:numPr>
+        <w:spacing w:after="80"/>
+      </w:pPr>
+      <w:r>
         <w:t xml:space="preserve">Puntaje por precision y velocidad.</w:t>
       </w:r>
     </w:p>
@@ -133,6 +145,18 @@
       </w:pPr>
       <w:r>
         <w:t xml:space="preserve">Historial, mejores puntajes y estadisticas visuales con persistencia local.</w:t>
+      </w:r>
+    </w:p>
+    <w:p>
+      <w:pPr>
+        <w:numPr>
+          <w:ilvl w:val="0"/>
+          <w:numId w:val="1"/>
+        </w:numPr>
+        <w:spacing w:after="80"/>
+      </w:pPr>
+      <w:r>
+        <w:t xml:space="preserve">Reinicio de ronda y borrado de historial con confirmacion en pantalla.</w:t>
       </w:r>
     </w:p>
     <w:p>
@@ -760,6 +784,18 @@
       </w:pPr>
       <w:r>
         <w:t xml:space="preserve">Persistencia aislada en src/game/storage.ts usando AsyncStorage.</w:t>
+      </w:r>
+    </w:p>
+    <w:p>
+      <w:pPr>
+        <w:numPr>
+          <w:ilvl w:val="0"/>
+          <w:numId w:val="1"/>
+        </w:numPr>
+        <w:spacing w:after="80"/>
+      </w:pPr>
+      <w:r>
+        <w:t xml:space="preserve">Historial con confirmacion propia en la interfaz para funcionar igual en web y mobile.</w:t>
       </w:r>
     </w:p>
     <w:p>

</xml_diff>

<commit_message>
Implement mental math challenge app
</commit_message>
<xml_diff>
--- a/Descripcion_Funcionalidades.docx
+++ b/Descripcion_Funcionalidades.docx
@@ -157,6 +157,54 @@
       </w:pPr>
       <w:r>
         <w:t xml:space="preserve">Reinicio de ronda y borrado de historial con confirmacion en pantalla.</w:t>
+      </w:r>
+    </w:p>
+    <w:p>
+      <w:pPr>
+        <w:numPr>
+          <w:ilvl w:val="0"/>
+          <w:numId w:val="1"/>
+        </w:numPr>
+        <w:spacing w:after="80"/>
+      </w:pPr>
+      <w:r>
+        <w:t xml:space="preserve">Cuenta regresiva animada 3-2-1 al iniciar o reiniciar una ronda.</w:t>
+      </w:r>
+    </w:p>
+    <w:p>
+      <w:pPr>
+        <w:numPr>
+          <w:ilvl w:val="0"/>
+          <w:numId w:val="1"/>
+        </w:numPr>
+        <w:spacing w:after="80"/>
+      </w:pPr>
+      <w:r>
+        <w:t xml:space="preserve">Sonidos locales para acierto, error y timeout, configurables desde el inicio.</w:t>
+      </w:r>
+    </w:p>
+    <w:p>
+      <w:pPr>
+        <w:numPr>
+          <w:ilvl w:val="0"/>
+          <w:numId w:val="1"/>
+        </w:numPr>
+        <w:spacing w:after="80"/>
+      </w:pPr>
+      <w:r>
+        <w:t xml:space="preserve">Animaciones de feedback, transicion de operaciones y pulso de puntaje.</w:t>
+      </w:r>
+    </w:p>
+    <w:p>
+      <w:pPr>
+        <w:numPr>
+          <w:ilvl w:val="0"/>
+          <w:numId w:val="1"/>
+        </w:numPr>
+        <w:spacing w:after="80"/>
+      </w:pPr>
+      <w:r>
+        <w:t xml:space="preserve">Graficos avanzados de evolucion, tiempos, distribucion por modo/dificultad y rachas.</w:t>
       </w:r>
     </w:p>
     <w:p>
@@ -796,6 +844,18 @@
       </w:pPr>
       <w:r>
         <w:t xml:space="preserve">Historial con confirmacion propia en la interfaz para funcionar igual en web y mobile.</w:t>
+      </w:r>
+    </w:p>
+    <w:p>
+      <w:pPr>
+        <w:numPr>
+          <w:ilvl w:val="0"/>
+          <w:numId w:val="1"/>
+        </w:numPr>
+        <w:spacing w:after="80"/>
+      </w:pPr>
+      <w:r>
+        <w:t xml:space="preserve">Efectos de sonido con archivos locales y sin permisos de microfono o conexion externa.</w:t>
       </w:r>
     </w:p>
     <w:p>
@@ -922,7 +982,7 @@
         <w:rPr>
           <w:b/>
         </w:rPr>
-        <w:t xml:space="preserve">Modo verdadero / falso</w:t>
+        <w:t xml:space="preserve">Cuenta regresiva animada</w:t>
       </w:r>
     </w:p>
     <w:p>
@@ -933,7 +993,7 @@
         <w:drawing>
           <wp:inline distT="0" distB="0" distL="0" distR="0">
             <wp:extent cx="2423160" cy="7455877"/>
-            <wp:docPr id="2" name="Modo verdadero / falso" descr="Modo verdadero / falso"/>
+            <wp:docPr id="2" name="Cuenta regresiva animada" descr="Cuenta regresiva animada"/>
             <wp:cNvGraphicFramePr>
               <a:graphicFrameLocks noChangeAspect="1"/>
             </wp:cNvGraphicFramePr>
@@ -941,7 +1001,7 @@
               <a:graphicData uri="http://schemas.openxmlformats.org/drawingml/2006/picture">
                 <pic:pic>
                   <pic:nvPicPr>
-                    <pic:cNvPr id="2" name="Modo verdadero / falso"/>
+                    <pic:cNvPr id="2" name="Cuenta regresiva animada"/>
                     <pic:cNvPicPr/>
                   </pic:nvPicPr>
                   <pic:blipFill>
@@ -975,7 +1035,7 @@
         <w:rPr>
           <w:b/>
         </w:rPr>
-        <w:t xml:space="preserve">Feedback de respuesta</w:t>
+        <w:t xml:space="preserve">Modo clasico</w:t>
       </w:r>
     </w:p>
     <w:p>
@@ -986,7 +1046,7 @@
         <w:drawing>
           <wp:inline distT="0" distB="0" distL="0" distR="0">
             <wp:extent cx="2423160" cy="7455877"/>
-            <wp:docPr id="3" name="Feedback de respuesta" descr="Feedback de respuesta"/>
+            <wp:docPr id="3" name="Modo clasico" descr="Modo clasico"/>
             <wp:cNvGraphicFramePr>
               <a:graphicFrameLocks noChangeAspect="1"/>
             </wp:cNvGraphicFramePr>
@@ -994,7 +1054,7 @@
               <a:graphicData uri="http://schemas.openxmlformats.org/drawingml/2006/picture">
                 <pic:pic>
                   <pic:nvPicPr>
-                    <pic:cNvPr id="3" name="Feedback de respuesta"/>
+                    <pic:cNvPr id="3" name="Modo clasico"/>
                     <pic:cNvPicPr/>
                   </pic:nvPicPr>
                   <pic:blipFill>
@@ -1028,7 +1088,7 @@
         <w:rPr>
           <w:b/>
         </w:rPr>
-        <w:t xml:space="preserve">Resultado de ronda</w:t>
+        <w:t xml:space="preserve">Modo verdadero / falso</w:t>
       </w:r>
     </w:p>
     <w:p>
@@ -1039,7 +1099,7 @@
         <w:drawing>
           <wp:inline distT="0" distB="0" distL="0" distR="0">
             <wp:extent cx="2423160" cy="7455877"/>
-            <wp:docPr id="4" name="Resultado de ronda" descr="Resultado de ronda"/>
+            <wp:docPr id="4" name="Modo verdadero / falso" descr="Modo verdadero / falso"/>
             <wp:cNvGraphicFramePr>
               <a:graphicFrameLocks noChangeAspect="1"/>
             </wp:cNvGraphicFramePr>
@@ -1047,7 +1107,7 @@
               <a:graphicData uri="http://schemas.openxmlformats.org/drawingml/2006/picture">
                 <pic:pic>
                   <pic:nvPicPr>
-                    <pic:cNvPr id="4" name="Resultado de ronda"/>
+                    <pic:cNvPr id="4" name="Modo verdadero / falso"/>
                     <pic:cNvPicPr/>
                   </pic:nvPicPr>
                   <pic:blipFill>
@@ -1081,7 +1141,7 @@
         <w:rPr>
           <w:b/>
         </w:rPr>
-        <w:t xml:space="preserve">Historial y estadisticas</w:t>
+        <w:t xml:space="preserve">Modo multiple choice</w:t>
       </w:r>
     </w:p>
     <w:p>
@@ -1092,7 +1152,7 @@
         <w:drawing>
           <wp:inline distT="0" distB="0" distL="0" distR="0">
             <wp:extent cx="2423160" cy="7455877"/>
-            <wp:docPr id="5" name="Historial y estadisticas" descr="Historial y estadisticas"/>
+            <wp:docPr id="5" name="Modo multiple choice" descr="Modo multiple choice"/>
             <wp:cNvGraphicFramePr>
               <a:graphicFrameLocks noChangeAspect="1"/>
             </wp:cNvGraphicFramePr>
@@ -1100,7 +1160,7 @@
               <a:graphicData uri="http://schemas.openxmlformats.org/drawingml/2006/picture">
                 <pic:pic>
                   <pic:nvPicPr>
-                    <pic:cNvPr id="5" name="Historial y estadisticas"/>
+                    <pic:cNvPr id="5" name="Modo multiple choice"/>
                     <pic:cNvPicPr/>
                   </pic:nvPicPr>
                   <pic:blipFill>
@@ -1127,6 +1187,324 @@
     </w:p>
     <w:p>
       <w:pPr>
+        <w:pStyle w:val="Caption"/>
+        <w:spacing w:after="80"/>
+      </w:pPr>
+      <w:r>
+        <w:rPr>
+          <w:b/>
+        </w:rPr>
+        <w:t xml:space="preserve">Modo contra reloj</w:t>
+      </w:r>
+    </w:p>
+    <w:p>
+      <w:pPr>
+        <w:spacing w:before="80" w:after="240"/>
+      </w:pPr>
+      <w:r>
+        <w:drawing>
+          <wp:inline distT="0" distB="0" distL="0" distR="0">
+            <wp:extent cx="2423160" cy="7455877"/>
+            <wp:docPr id="6" name="Modo contra reloj" descr="Modo contra reloj"/>
+            <wp:cNvGraphicFramePr>
+              <a:graphicFrameLocks noChangeAspect="1"/>
+            </wp:cNvGraphicFramePr>
+            <a:graphic>
+              <a:graphicData uri="http://schemas.openxmlformats.org/drawingml/2006/picture">
+                <pic:pic>
+                  <pic:nvPicPr>
+                    <pic:cNvPr id="6" name="Modo contra reloj"/>
+                    <pic:cNvPicPr/>
+                  </pic:nvPicPr>
+                  <pic:blipFill>
+                    <a:blip r:embed="rId6"/>
+                    <a:stretch>
+                      <a:fillRect/>
+                    </a:stretch>
+                  </pic:blipFill>
+                  <pic:spPr>
+                    <a:xfrm>
+                      <a:off x="0" y="0"/>
+                      <a:ext cx="2423160" cy="7455877"/>
+                    </a:xfrm>
+                    <a:prstGeom prst="rect">
+                      <a:avLst/>
+                    </a:prstGeom>
+                  </pic:spPr>
+                </pic:pic>
+              </a:graphicData>
+            </a:graphic>
+          </wp:inline>
+        </w:drawing>
+      </w:r>
+    </w:p>
+    <w:p>
+      <w:pPr>
+        <w:pStyle w:val="Caption"/>
+        <w:spacing w:after="80"/>
+      </w:pPr>
+      <w:r>
+        <w:rPr>
+          <w:b/>
+        </w:rPr>
+        <w:t xml:space="preserve">Feedback de respuesta</w:t>
+      </w:r>
+    </w:p>
+    <w:p>
+      <w:pPr>
+        <w:spacing w:before="80" w:after="240"/>
+      </w:pPr>
+      <w:r>
+        <w:drawing>
+          <wp:inline distT="0" distB="0" distL="0" distR="0">
+            <wp:extent cx="2423160" cy="7455877"/>
+            <wp:docPr id="7" name="Feedback de respuesta" descr="Feedback de respuesta"/>
+            <wp:cNvGraphicFramePr>
+              <a:graphicFrameLocks noChangeAspect="1"/>
+            </wp:cNvGraphicFramePr>
+            <a:graphic>
+              <a:graphicData uri="http://schemas.openxmlformats.org/drawingml/2006/picture">
+                <pic:pic>
+                  <pic:nvPicPr>
+                    <pic:cNvPr id="7" name="Feedback de respuesta"/>
+                    <pic:cNvPicPr/>
+                  </pic:nvPicPr>
+                  <pic:blipFill>
+                    <a:blip r:embed="rId7"/>
+                    <a:stretch>
+                      <a:fillRect/>
+                    </a:stretch>
+                  </pic:blipFill>
+                  <pic:spPr>
+                    <a:xfrm>
+                      <a:off x="0" y="0"/>
+                      <a:ext cx="2423160" cy="7455877"/>
+                    </a:xfrm>
+                    <a:prstGeom prst="rect">
+                      <a:avLst/>
+                    </a:prstGeom>
+                  </pic:spPr>
+                </pic:pic>
+              </a:graphicData>
+            </a:graphic>
+          </wp:inline>
+        </w:drawing>
+      </w:r>
+    </w:p>
+    <w:p>
+      <w:pPr>
+        <w:pStyle w:val="Caption"/>
+        <w:spacing w:after="80"/>
+      </w:pPr>
+      <w:r>
+        <w:rPr>
+          <w:b/>
+        </w:rPr>
+        <w:t xml:space="preserve">Resultado de ronda con detalle por pregunta</w:t>
+      </w:r>
+    </w:p>
+    <w:p>
+      <w:pPr>
+        <w:spacing w:before="80" w:after="240"/>
+      </w:pPr>
+      <w:r>
+        <w:drawing>
+          <wp:inline distT="0" distB="0" distL="0" distR="0">
+            <wp:extent cx="2423160" cy="7455877"/>
+            <wp:docPr id="8" name="Resultado de ronda con detalle por pregunta" descr="Resultado de ronda con detalle por pregunta"/>
+            <wp:cNvGraphicFramePr>
+              <a:graphicFrameLocks noChangeAspect="1"/>
+            </wp:cNvGraphicFramePr>
+            <a:graphic>
+              <a:graphicData uri="http://schemas.openxmlformats.org/drawingml/2006/picture">
+                <pic:pic>
+                  <pic:nvPicPr>
+                    <pic:cNvPr id="8" name="Resultado de ronda con detalle por pregunta"/>
+                    <pic:cNvPicPr/>
+                  </pic:nvPicPr>
+                  <pic:blipFill>
+                    <a:blip r:embed="rId8"/>
+                    <a:stretch>
+                      <a:fillRect/>
+                    </a:stretch>
+                  </pic:blipFill>
+                  <pic:spPr>
+                    <a:xfrm>
+                      <a:off x="0" y="0"/>
+                      <a:ext cx="2423160" cy="7455877"/>
+                    </a:xfrm>
+                    <a:prstGeom prst="rect">
+                      <a:avLst/>
+                    </a:prstGeom>
+                  </pic:spPr>
+                </pic:pic>
+              </a:graphicData>
+            </a:graphic>
+          </wp:inline>
+        </w:drawing>
+      </w:r>
+    </w:p>
+    <w:p>
+      <w:pPr>
+        <w:pStyle w:val="Caption"/>
+        <w:spacing w:after="80"/>
+      </w:pPr>
+      <w:r>
+        <w:rPr>
+          <w:b/>
+        </w:rPr>
+        <w:t xml:space="preserve">Historial y estadisticas</w:t>
+      </w:r>
+    </w:p>
+    <w:p>
+      <w:pPr>
+        <w:spacing w:before="80" w:after="240"/>
+      </w:pPr>
+      <w:r>
+        <w:drawing>
+          <wp:inline distT="0" distB="0" distL="0" distR="0">
+            <wp:extent cx="2423160" cy="7332482"/>
+            <wp:docPr id="9" name="Historial y estadisticas" descr="Historial y estadisticas"/>
+            <wp:cNvGraphicFramePr>
+              <a:graphicFrameLocks noChangeAspect="1"/>
+            </wp:cNvGraphicFramePr>
+            <a:graphic>
+              <a:graphicData uri="http://schemas.openxmlformats.org/drawingml/2006/picture">
+                <pic:pic>
+                  <pic:nvPicPr>
+                    <pic:cNvPr id="9" name="Historial y estadisticas"/>
+                    <pic:cNvPicPr/>
+                  </pic:nvPicPr>
+                  <pic:blipFill>
+                    <a:blip r:embed="rId9"/>
+                    <a:stretch>
+                      <a:fillRect/>
+                    </a:stretch>
+                  </pic:blipFill>
+                  <pic:spPr>
+                    <a:xfrm>
+                      <a:off x="0" y="0"/>
+                      <a:ext cx="2423160" cy="7332482"/>
+                    </a:xfrm>
+                    <a:prstGeom prst="rect">
+                      <a:avLst/>
+                    </a:prstGeom>
+                  </pic:spPr>
+                </pic:pic>
+              </a:graphicData>
+            </a:graphic>
+          </wp:inline>
+        </w:drawing>
+      </w:r>
+    </w:p>
+    <w:p>
+      <w:pPr>
+        <w:pStyle w:val="Caption"/>
+        <w:spacing w:after="80"/>
+      </w:pPr>
+      <w:r>
+        <w:rPr>
+          <w:b/>
+        </w:rPr>
+        <w:t xml:space="preserve">Confirmacion de borrado de historial</w:t>
+      </w:r>
+    </w:p>
+    <w:p>
+      <w:pPr>
+        <w:spacing w:before="80" w:after="240"/>
+      </w:pPr>
+      <w:r>
+        <w:drawing>
+          <wp:inline distT="0" distB="0" distL="0" distR="0">
+            <wp:extent cx="2423160" cy="7332482"/>
+            <wp:docPr id="10" name="Confirmacion de borrado de historial" descr="Confirmacion de borrado de historial"/>
+            <wp:cNvGraphicFramePr>
+              <a:graphicFrameLocks noChangeAspect="1"/>
+            </wp:cNvGraphicFramePr>
+            <a:graphic>
+              <a:graphicData uri="http://schemas.openxmlformats.org/drawingml/2006/picture">
+                <pic:pic>
+                  <pic:nvPicPr>
+                    <pic:cNvPr id="10" name="Confirmacion de borrado de historial"/>
+                    <pic:cNvPicPr/>
+                  </pic:nvPicPr>
+                  <pic:blipFill>
+                    <a:blip r:embed="rId10"/>
+                    <a:stretch>
+                      <a:fillRect/>
+                    </a:stretch>
+                  </pic:blipFill>
+                  <pic:spPr>
+                    <a:xfrm>
+                      <a:off x="0" y="0"/>
+                      <a:ext cx="2423160" cy="7332482"/>
+                    </a:xfrm>
+                    <a:prstGeom prst="rect">
+                      <a:avLst/>
+                    </a:prstGeom>
+                  </pic:spPr>
+                </pic:pic>
+              </a:graphicData>
+            </a:graphic>
+          </wp:inline>
+        </w:drawing>
+      </w:r>
+    </w:p>
+    <w:p>
+      <w:pPr>
+        <w:pStyle w:val="Caption"/>
+        <w:spacing w:after="80"/>
+      </w:pPr>
+      <w:r>
+        <w:rPr>
+          <w:b/>
+        </w:rPr>
+        <w:t xml:space="preserve">Historial vacio luego de borrar datos</w:t>
+      </w:r>
+    </w:p>
+    <w:p>
+      <w:pPr>
+        <w:spacing w:before="80" w:after="240"/>
+      </w:pPr>
+      <w:r>
+        <w:drawing>
+          <wp:inline distT="0" distB="0" distL="0" distR="0">
+            <wp:extent cx="2423160" cy="7455877"/>
+            <wp:docPr id="11" name="Historial vacio luego de borrar datos" descr="Historial vacio luego de borrar datos"/>
+            <wp:cNvGraphicFramePr>
+              <a:graphicFrameLocks noChangeAspect="1"/>
+            </wp:cNvGraphicFramePr>
+            <a:graphic>
+              <a:graphicData uri="http://schemas.openxmlformats.org/drawingml/2006/picture">
+                <pic:pic>
+                  <pic:nvPicPr>
+                    <pic:cNvPr id="11" name="Historial vacio luego de borrar datos"/>
+                    <pic:cNvPicPr/>
+                  </pic:nvPicPr>
+                  <pic:blipFill>
+                    <a:blip r:embed="rId11"/>
+                    <a:stretch>
+                      <a:fillRect/>
+                    </a:stretch>
+                  </pic:blipFill>
+                  <pic:spPr>
+                    <a:xfrm>
+                      <a:off x="0" y="0"/>
+                      <a:ext cx="2423160" cy="7455877"/>
+                    </a:xfrm>
+                    <a:prstGeom prst="rect">
+                      <a:avLst/>
+                    </a:prstGeom>
+                  </pic:spPr>
+                </pic:pic>
+              </a:graphicData>
+            </a:graphic>
+          </wp:inline>
+        </w:drawing>
+      </w:r>
+    </w:p>
+    <w:p>
+      <w:pPr>
         <w:pStyle w:val="Heading1"/>
         <w:spacing w:after="160"/>
       </w:pPr>
@@ -1179,7 +1557,7 @@
         <w:spacing w:after="80"/>
       </w:pPr>
       <w:r>
-        <w:t xml:space="preserve">Capturas automatizadas con Chrome headless para inicio, juego, feedback, resultado e historial.</w:t>
+        <w:t xml:space="preserve">Capturas automatizadas con Chrome headless para los cuatro modos, feedback, resultado, historial y borrado de datos.</w:t>
       </w:r>
     </w:p>
     <w:sectPr>

</xml_diff>